<commit_message>
v2.50: the Pulse dropped from the evening form (John's word, 2026-10-28) - gone from Evening 8 (homework slide and notes, run sheet, take-home and its slide image, page) and from Evening 9's deck notes (the return bin); leader notes rebuilt; the handbook's "quarterly look" becomes the return round at each long break with the quiet tally; Evenings 12 and 13 (Pulse 3) to rework when prepared; synced to OneDrive
Co-Authored-By: Claude Opus 5.5 <noreply@anthropic.com>
</commit_message>
<xml_diff>
--- a/_implementation-notes/evening-series/FotH Pilot Session 11 Evening Run Sheet DRAFT v1.docx
+++ b/_implementation-notes/evening-series/FotH Pilot Session 11 Evening Run Sheet DRAFT v1.docx
@@ -610,7 +610,7 @@
               <w:pStyle w:val="Compact"/>
             </w:pPr>
             <w:r>
-              <w:t>Homework and the Christmas send-off: the handout walked; the break chosen from The Practices So Far; the returning rule; who to reach; partners named; the Pulse goes home.</w:t>
+              <w:t>Homework and the Christmas send-off: the handout walked; the break chosen from The Practices So Far; the returning rule; who to reach; partners named.</w:t>
             </w:r>
           </w:p>
         </w:tc>
@@ -790,7 +790,7 @@
         <w:t xml:space="preserve"> </w:t>
       </w:r>
       <w:r>
-        <w:t>The Personal Doubts Inventory: list 5–10 scriptures you say you believe, rate your honest trust 1–5, and write the specific doubt for the two or three lowest. No shame. Just data. The Quarterly Pulse (H11.4) goes home tonight; bring it to The Return.</w:t>
+        <w:t>The Personal Doubts Inventory: list 5–10 scriptures you say you believe, rate your honest trust 1–5, and write the specific doubt for the two or three lowest. No shame. Just data.</w:t>
       </w:r>
     </w:p>
     <w:p>

</xml_diff>